<commit_message>
Nota executiva: Q6 descreve a página realmente construída
Co-Authored-By: Claude Sonnet 5.5 <noreply@anthropic.com>
Claude-Session: https://claude.ai/code/session_0165aZC3jcU4kecUwExfQtw7
</commit_message>
<xml_diff>
--- a/powerbi_logistica/NotaExecutiva_CODIGO.docx
+++ b/powerbi_logistica/NotaExecutiva_CODIGO.docx
@@ -11344,7 +11344,7 @@
           <w:sz w:val="20"/>
           <w:szCs w:val="20"/>
         </w:rPr>
-        <w:t xml:space="preserve">Página «Visão Executiva»: </w:t>
+        <w:t xml:space="preserve">Página «LogiDistrib – Acompanhamento executivo»: </w:t>
       </w:r>
       <w:r>
         <w:rPr>
@@ -11362,7 +11362,7 @@
           <w:sz w:val="20"/>
           <w:szCs w:val="20"/>
         </w:rPr>
-        <w:t xml:space="preserve"> com variação face ao período comparável de 2025 (encomendas, valor, taxa de margem, custo logístico médio, % processadas ≤ 4 d.u., % entregas no prazo); </w:t>
+        <w:t xml:space="preserve"> com os indicadores fundamentais de 2026 (encomendas, valor, taxa de margem, custo logístico médio, % processadas ≤ 4 d.u., % entregas no prazo) e, por baixo de cada um, um </w:t>
       </w:r>
       <w:r>
         <w:rPr>
@@ -11372,7 +11372,7 @@
           <w:sz w:val="20"/>
           <w:szCs w:val="20"/>
         </w:rPr>
-        <w:t xml:space="preserve">linhas mensais</w:t>
+        <w:t xml:space="preserve">cartão com a variação face ao período comparável de 2025</w:t>
       </w:r>
       <w:r>
         <w:rPr>
@@ -11380,7 +11380,7 @@
           <w:sz w:val="20"/>
           <w:szCs w:val="20"/>
         </w:rPr>
-        <w:t xml:space="preserve"> 2025 vs 2026 da pontualidade, com a linha do objetivo; </w:t>
+        <w:t xml:space="preserve"> (+26,9 %, +25,5 %, +0,33 pp, −4,8 %, +0,29 pp, −0,01 pp); </w:t>
       </w:r>
       <w:r>
         <w:rPr>
@@ -11390,7 +11390,7 @@
           <w:sz w:val="20"/>
           <w:szCs w:val="20"/>
         </w:rPr>
-        <w:t xml:space="preserve">barras por centro</w:t>
+        <w:t xml:space="preserve">linhas mensais</w:t>
       </w:r>
       <w:r>
         <w:rPr>
@@ -11398,7 +11398,7 @@
           <w:sz w:val="20"/>
           <w:szCs w:val="20"/>
         </w:rPr>
-        <w:t xml:space="preserve"> (pontualidade real vs objetivo) e </w:t>
+        <w:t xml:space="preserve"> 2025 vs 2026 da pontualidade, com a linha do objetivo (89,7 %); e quatro </w:t>
       </w:r>
       <w:r>
         <w:rPr>
@@ -11408,7 +11408,7 @@
           <w:sz w:val="20"/>
           <w:szCs w:val="20"/>
         </w:rPr>
-        <w:t xml:space="preserve">matriz de centros</w:t>
+        <w:t xml:space="preserve">segmentadores</w:t>
       </w:r>
       <w:r>
         <w:rPr>
@@ -11416,7 +11416,7 @@
           <w:sz w:val="20"/>
           <w:szCs w:val="20"/>
         </w:rPr>
-        <w:t xml:space="preserve"> com semáforos (volume, custo e pontualidade vs objetivo); segmentadores de ano, centro, transportadora, tipo de serviço e região do cliente.</w:t>
+        <w:t xml:space="preserve">: ano, centro, tipo de serviço e região do cliente. A comparação por centro face aos objetivos está na página da Q5.</w:t>
       </w:r>
     </w:p>
     <w:p>
@@ -11439,7 +11439,7 @@
           <w:sz w:val="20"/>
           <w:szCs w:val="20"/>
         </w:rPr>
-        <w:t xml:space="preserve"> linhas sobrepostas 2025 vs 2026, e não barras anuais. A pergunta da Direção é de tendência e sazonalidade: a sobreposição mostra que a pontualidade se mantém igual em 2026 e que cai em nov–dez 2025 (84 %–85 %) quando o volume sobe, um risco que as médias anuais escondem. </w:t>
+        <w:t xml:space="preserve"> linhas sobrepostas 2025 vs 2026, e não barras anuais. A pergunta da Direção é de tendência e sazonalidade: a sobreposição mostra que a pontualidade de 2026 não melhora face a 2025 e fica abaixo do objetivo em todos os meses; fora do período comparável, em nov–dez 2025, caiu para 84 %–85 % quando o volume sobe, um risco que as médias anuais escondem. </w:t>
       </w:r>
       <w:r>
         <w:rPr>
@@ -11457,7 +11457,7 @@
           <w:sz w:val="20"/>
           <w:szCs w:val="20"/>
         </w:rPr>
-        <w:t xml:space="preserve"> o segmentador «Ano» tem a interação desativada (Editar interações → Nenhum) no gráfico de linhas (Figura 2), que precisa sempre dos dois anos; os restantes segmentadores continuam a filtrá-lo.</w:t>
+        <w:t xml:space="preserve"> o segmentador «Ano» tem a interação desativada (Editar interações → Nenhum) no gráfico de linhas (Figura 2), que precisa sempre dos dois anos; os restantes segmentadores (centro, tipo de serviço e região do cliente) continuam a filtrá-lo.</w:t>
       </w:r>
     </w:p>
     <w:p>

</xml_diff>

<commit_message>
Nota executiva: Q9.1 alinhada com o visual Key Influencers construído
Co-Authored-By: Claude Sonnet 5.5 <noreply@anthropic.com>
Claude-Session: https://claude.ai/code/session_0165aZC3jcU4kecUwExfQtw7
</commit_message>
<xml_diff>
--- a/powerbi_logistica/NotaExecutiva_CODIGO.docx
+++ b/powerbi_logistica/NotaExecutiva_CODIGO.docx
@@ -12369,7 +12369,7 @@
           <w:sz w:val="20"/>
           <w:szCs w:val="20"/>
         </w:rPr>
-        <w:t xml:space="preserve">Entrega Atrasada</w:t>
+        <w:t xml:space="preserve">entrega_atrasada</w:t>
       </w:r>
       <w:r>
         <w:rPr>
@@ -12377,7 +12377,7 @@
           <w:sz w:val="20"/>
           <w:szCs w:val="20"/>
         </w:rPr>
-        <w:t xml:space="preserve"> (coluna calculada: data de entrega &gt; data prometida; 1 310 de 10 693 encomendas = 12,3 %), ao nível da encomenda. Explicada por: região e segmento do cliente, tipo de cliente, tipo de serviço, prioridade, canal, transportadora, centro, peso total, nº de linhas, existência de frágeis e região diferente da do centro. </w:t>
+        <w:t xml:space="preserve"> (coluna: data de entrega &gt; data prometida; 1 310 de 10 693 encomendas = 12,3 %), ao nível da encomenda. Explicada por: região, segmento e tipo de cliente, tipo de serviço, prioridade, canal, transportadora, centro, peso total, nº de linhas, existência de frágeis, região diferente da do centro e dia da semana. </w:t>
       </w:r>
       <w:r>
         <w:rPr>
@@ -12387,7 +12387,7 @@
           <w:sz w:val="20"/>
           <w:szCs w:val="20"/>
         </w:rPr>
-        <w:t xml:space="preserve">Fatores principais:</w:t>
+        <w:t xml:space="preserve">Fatores principais (multiplicadores do visual, todos os dados):</w:t>
       </w:r>
       <w:r>
         <w:rPr>
@@ -12405,7 +12405,7 @@
           <w:sz w:val="20"/>
           <w:szCs w:val="20"/>
         </w:rPr>
-        <w:t xml:space="preserve">região do cliente = Interior</w:t>
+        <w:t xml:space="preserve">região do cliente = Interior – 2,22×</w:t>
       </w:r>
       <w:r>
         <w:rPr>
@@ -12413,7 +12413,7 @@
           <w:sz w:val="20"/>
           <w:szCs w:val="20"/>
         </w:rPr>
-        <w:t xml:space="preserve"> – 23,5 % de atrasos vs 10,6 % no resto (2,2×); (2) </w:t>
+        <w:t xml:space="preserve"> (23,5 % de atrasos vs 10,6 % no resto); (2) </w:t>
       </w:r>
       <w:r>
         <w:rPr>
@@ -12423,7 +12423,7 @@
           <w:sz w:val="20"/>
           <w:szCs w:val="20"/>
         </w:rPr>
-        <w:t xml:space="preserve">serviço Economy</w:t>
+        <w:t xml:space="preserve">serviço Economy – 1,54×</w:t>
       </w:r>
       <w:r>
         <w:rPr>
@@ -12431,7 +12431,7 @@
           <w:sz w:val="20"/>
           <w:szCs w:val="20"/>
         </w:rPr>
-        <w:t xml:space="preserve"> – 16,7 % vs 10,7 % (1,6×; Express: 7,5 %); (3) </w:t>
+        <w:t xml:space="preserve"> (16,7 % vs 10,7 %; Express: 7,5 %); (3) </w:t>
       </w:r>
       <w:r>
         <w:rPr>
@@ -12441,7 +12441,7 @@
           <w:sz w:val="20"/>
           <w:szCs w:val="20"/>
         </w:rPr>
-        <w:t xml:space="preserve">prioridade Normal</w:t>
+        <w:t xml:space="preserve">encomendas com mais de 4 linhas – 1,42×</w:t>
       </w:r>
       <w:r>
         <w:rPr>
@@ -12449,7 +12449,7 @@
           <w:sz w:val="20"/>
           <w:szCs w:val="20"/>
         </w:rPr>
-        <w:t xml:space="preserve"> – 12,9 % vs 9,4 % da Alta; (4) </w:t>
+        <w:t xml:space="preserve">; (4) </w:t>
       </w:r>
       <w:r>
         <w:rPr>
@@ -12459,7 +12459,7 @@
           <w:sz w:val="20"/>
           <w:szCs w:val="20"/>
         </w:rPr>
-        <w:t xml:space="preserve">peso &gt; 20 kg</w:t>
+        <w:t xml:space="preserve">prioridade Normal – 1,39×</w:t>
       </w:r>
       <w:r>
         <w:rPr>
@@ -12467,7 +12467,25 @@
           <w:sz w:val="20"/>
           <w:szCs w:val="20"/>
         </w:rPr>
-        <w:t xml:space="preserve"> – 16,9 % vs 11,9 %. Transportadora, canal e segmento do cliente praticamente não diferenciam (±1–2 pp).</w:t>
+        <w:t xml:space="preserve"> (12,9 % vs 9,4 % da Alta); (5) segmento PME – 1,11× (efeito fraco). Transportadora, canal e frágil praticamente não diferenciam. O separador </w:t>
+      </w:r>
+      <w:r>
+        <w:rPr>
+          <w:rFonts w:ascii="Calibri" w:cs="Calibri" w:eastAsia="Calibri" w:hAnsi="Calibri"/>
+          <w:b/>
+          <w:bCs/>
+          <w:sz w:val="20"/>
+          <w:szCs w:val="20"/>
+        </w:rPr>
+        <w:t xml:space="preserve">Top segments</w:t>
+      </w:r>
+      <w:r>
+        <w:rPr>
+          <w:rFonts w:ascii="Calibri" w:cs="Calibri" w:eastAsia="Calibri" w:hAnsi="Calibri"/>
+          <w:sz w:val="20"/>
+          <w:szCs w:val="20"/>
+        </w:rPr>
+        <w:t xml:space="preserve"> devolve 4 segmentos com 15,6 %–24,2 % de atrasos (média 12,3 %); o mais crítico (24,2 %, 773 enc., 7,2 % da base) é «Interior e canal não-Portal», em que o canal acrescenta pouco, pelo que o fator dominante é a região.</w:t>
       </w:r>
     </w:p>
     <w:p>
@@ -12569,7 +12587,7 @@
           <w:sz w:val="18"/>
           <w:szCs w:val="18"/>
         </w:rPr>
-        <w:t xml:space="preserve">Atraso Entrega (dias)</w:t>
+        <w:t xml:space="preserve">atraso_entrega_dias</w:t>
       </w:r>
       <w:r>
         <w:rPr>

</xml_diff>